<commit_message>
Adjusted R square for multi linear regression
</commit_message>
<xml_diff>
--- a/machine_learning_basics/performance metric for linear regression MSE MAE RMSE R-Sqaured.docx
+++ b/machine_learning_basics/performance metric for linear regression MSE MAE RMSE R-Sqaured.docx
@@ -13,20 +13,15 @@
         <w:t xml:space="preserve"> the performs accuracy prediction of linear regression model</w:t>
       </w:r>
       <w:r>
-        <w:t xml:space="preserve">, all the below three error </w:t>
-      </w:r>
-      <w:proofErr w:type="gramStart"/>
-      <w:r>
-        <w:t>metric</w:t>
-      </w:r>
-      <w:proofErr w:type="gramEnd"/>
-      <w:r>
-        <w:t xml:space="preserve"> are helps to find the distance between actual data point and the predicted data.</w:t>
+        <w:t>, all the below three error metric are helps to find the distance between actual data point and the predicted data.</w:t>
       </w:r>
     </w:p>
     <w:p/>
     <w:p>
       <w:r>
+        <w:rPr>
+          <w:noProof/>
+        </w:rPr>
         <w:drawing>
           <wp:inline distT="0" distB="0" distL="0" distR="0" wp14:anchorId="0484B1A6" wp14:editId="2D720CE9">
             <wp:extent cx="5731510" cy="2366645"/>
@@ -82,15 +77,7 @@
         <w:t>stance</w:t>
       </w:r>
       <w:r>
-        <w:t xml:space="preserve"> between prediction data point and actual data point, in below image a dot not in x is the predicted data point, a point within the line </w:t>
-      </w:r>
-      <w:proofErr w:type="gramStart"/>
-      <w:r>
-        <w:t>are</w:t>
-      </w:r>
-      <w:proofErr w:type="gramEnd"/>
-      <w:r>
-        <w:t xml:space="preserve"> called actual data point</w:t>
+        <w:t xml:space="preserve"> between prediction data point and actual data point, in below image a dot not in x is the predicted data point, a point within the line are called actual data point</w:t>
       </w:r>
       <w:r>
         <w:t>, that founded sum of squared difference will be divided by mean</w:t>
@@ -98,6 +85,9 @@
     </w:p>
     <w:p>
       <w:r>
+        <w:rPr>
+          <w:noProof/>
+        </w:rPr>
         <w:drawing>
           <wp:inline distT="0" distB="0" distL="0" distR="0" wp14:anchorId="3D019916" wp14:editId="015AC15B">
             <wp:extent cx="3139712" cy="2370025"/>
@@ -137,6 +127,9 @@
     </w:p>
     <w:p>
       <w:r>
+        <w:rPr>
+          <w:noProof/>
+        </w:rPr>
         <w:drawing>
           <wp:inline distT="0" distB="0" distL="0" distR="0" wp14:anchorId="62EA5A45" wp14:editId="5395F7BC">
             <wp:extent cx="3033023" cy="571550"/>
@@ -176,15 +169,7 @@
     </w:p>
     <w:p>
       <w:r>
-        <w:t xml:space="preserve">Outliers can be detected in </w:t>
-      </w:r>
-      <w:proofErr w:type="spellStart"/>
-      <w:r>
-        <w:t>mse</w:t>
-      </w:r>
-      <w:proofErr w:type="spellEnd"/>
-      <w:r>
-        <w:t>.</w:t>
+        <w:t>Outliers can be detected in mse.</w:t>
       </w:r>
     </w:p>
     <w:p>
@@ -199,16 +184,14 @@
         <w:t>Mean absolute error will calculate only the distance between the actual data point and predicted data point, the values will not be squared like MSE.</w:t>
       </w:r>
       <w:r>
-        <w:t xml:space="preserve"> Outliers cannot be detected in </w:t>
-      </w:r>
-      <w:proofErr w:type="spellStart"/>
-      <w:r>
-        <w:t>mae</w:t>
-      </w:r>
-      <w:proofErr w:type="spellEnd"/>
-    </w:p>
-    <w:p>
-      <w:r>
+        <w:t xml:space="preserve"> Outliers cannot be detected in mae</w:t>
+      </w:r>
+    </w:p>
+    <w:p>
+      <w:r>
+        <w:rPr>
+          <w:noProof/>
+        </w:rPr>
         <w:drawing>
           <wp:inline distT="0" distB="0" distL="0" distR="0" wp14:anchorId="62FA9018" wp14:editId="4176D12B">
             <wp:extent cx="2331922" cy="495343"/>
@@ -276,15 +259,7 @@
     </w:p>
     <w:p>
       <w:r>
-        <w:t xml:space="preserve">This </w:t>
-      </w:r>
-      <w:proofErr w:type="gramStart"/>
-      <w:r>
-        <w:t>is also helps</w:t>
-      </w:r>
-      <w:proofErr w:type="gramEnd"/>
-      <w:r>
-        <w:t xml:space="preserve"> to </w:t>
+        <w:t xml:space="preserve">This is also helps to </w:t>
       </w:r>
       <w:r>
         <w:t>see how our model performed from the average fit line.</w:t>
@@ -293,19 +268,14 @@
         <w:t xml:space="preserve"> </w:t>
       </w:r>
       <w:r>
-        <w:t xml:space="preserve">It finds the distance between actual data point and predicted </w:t>
-      </w:r>
-      <w:proofErr w:type="gramStart"/>
-      <w:r>
-        <w:t>point(</w:t>
-      </w:r>
-      <w:proofErr w:type="gramEnd"/>
-      <w:r>
-        <w:t>sum of residual) and also it finds the distance between average line’s data point to actual data point(sum of total), both will be divided.</w:t>
-      </w:r>
-    </w:p>
-    <w:p>
-      <w:r>
+        <w:t>It finds the distance between actual data point and predicted point(sum of residual) and also it finds the distance between average line’s data point to actual data point(sum of total), both will be divided.</w:t>
+      </w:r>
+    </w:p>
+    <w:p>
+      <w:r>
+        <w:rPr>
+          <w:noProof/>
+        </w:rPr>
         <w:drawing>
           <wp:inline distT="0" distB="0" distL="0" distR="0" wp14:anchorId="31258390" wp14:editId="6CF2FA78">
             <wp:extent cx="5731510" cy="2225040"/>
@@ -345,19 +315,14 @@
     </w:p>
     <w:p>
       <w:r>
-        <w:t xml:space="preserve">So here the best fit line will have the minimum distance errors, while average line will have bigger distance error, so this r square will tell you how our best line’s error far from average fit line’s error. </w:t>
-      </w:r>
-      <w:proofErr w:type="gramStart"/>
-      <w:r>
-        <w:t>So</w:t>
-      </w:r>
-      <w:proofErr w:type="gramEnd"/>
-      <w:r>
-        <w:t xml:space="preserve"> res should always be less than total, in below formula we can say that 90 variance are the when we compare best fit’s line error compare to average fit line’s error.</w:t>
-      </w:r>
-    </w:p>
-    <w:p>
-      <w:r>
+        <w:t>So here the best fit line will have the minimum distance errors, while average line will have bigger distance error, so this r square will tell you how our best line’s error far from average fit line’s error. So res should always be less than total, in below formula we can say that 90 variance are the when we compare best fit’s line error compare to average fit line’s error.</w:t>
+      </w:r>
+    </w:p>
+    <w:p>
+      <w:r>
+        <w:rPr>
+          <w:noProof/>
+        </w:rPr>
         <w:drawing>
           <wp:inline distT="0" distB="0" distL="0" distR="0" wp14:anchorId="3749FE7A" wp14:editId="2CB44FCF">
             <wp:extent cx="1120237" cy="883997"/>
@@ -405,30 +370,17 @@
         <w:t xml:space="preserve">IMPORTANT NOTE: </w:t>
       </w:r>
       <w:r>
-        <w:t xml:space="preserve">R square values should be bigger if the model’s prediction is correct. </w:t>
-      </w:r>
-      <w:proofErr w:type="gramStart"/>
-      <w:r>
-        <w:t>Otherwise</w:t>
-      </w:r>
-      <w:proofErr w:type="gramEnd"/>
-      <w:r>
-        <w:t xml:space="preserve"> we can say model’s prediction is not good.</w:t>
-      </w:r>
-      <w:r>
-        <w:t xml:space="preserve"> And </w:t>
-      </w:r>
-      <w:proofErr w:type="gramStart"/>
-      <w:r>
-        <w:t>also</w:t>
-      </w:r>
-      <w:proofErr w:type="gramEnd"/>
-      <w:r>
-        <w:t xml:space="preserve"> MSE/AE should be less for good prediction model.</w:t>
-      </w:r>
-    </w:p>
-    <w:p>
-      <w:r>
+        <w:t>R square values should be bigger if the model’s prediction is correct. Otherwise we can say model’s prediction is not good.</w:t>
+      </w:r>
+      <w:r>
+        <w:t xml:space="preserve"> And also MSE/AE should be less for good prediction model.</w:t>
+      </w:r>
+    </w:p>
+    <w:p>
+      <w:r>
+        <w:rPr>
+          <w:noProof/>
+        </w:rPr>
         <w:drawing>
           <wp:inline distT="0" distB="0" distL="0" distR="0" wp14:anchorId="48AC5458" wp14:editId="6AB9EC06">
             <wp:extent cx="5731510" cy="2329180"/>
@@ -454,6 +406,81 @@
                     <a:xfrm>
                       <a:off x="0" y="0"/>
                       <a:ext cx="5731510" cy="2329180"/>
+                    </a:xfrm>
+                    <a:prstGeom prst="rect">
+                      <a:avLst/>
+                    </a:prstGeom>
+                  </pic:spPr>
+                </pic:pic>
+              </a:graphicData>
+            </a:graphic>
+          </wp:inline>
+        </w:drawing>
+      </w:r>
+    </w:p>
+    <w:p/>
+    <w:p>
+      <w:pPr>
+        <w:rPr>
+          <w:b/>
+          <w:bCs/>
+        </w:rPr>
+      </w:pPr>
+      <w:r>
+        <w:rPr>
+          <w:b/>
+          <w:bCs/>
+        </w:rPr>
+        <w:lastRenderedPageBreak/>
+        <w:t>ADJUSTED R-SQUARED</w:t>
+      </w:r>
+    </w:p>
+    <w:p>
+      <w:r>
+        <w:t>Used to check the performance for multi linear regression, simple r square cannot be used for multi linear regression which has more than two input variables or features.</w:t>
+      </w:r>
+      <w:r>
+        <w:t xml:space="preserve"> Because normal r square values are getting increased abnormally when more than two columns are added for calculation.</w:t>
+      </w:r>
+    </w:p>
+    <w:p>
+      <w:r>
+        <w:t>In below formula P is number of input variables.</w:t>
+      </w:r>
+      <w:r>
+        <w:t xml:space="preserve"> N total number of`</w:t>
+      </w:r>
+      <w:r>
+        <w:t>samples.</w:t>
+      </w:r>
+    </w:p>
+    <w:p>
+      <w:r>
+        <w:drawing>
+          <wp:inline distT="0" distB="0" distL="0" distR="0" wp14:anchorId="1BB0CE89" wp14:editId="43AD6433">
+            <wp:extent cx="5731510" cy="2661285"/>
+            <wp:effectExtent l="0" t="0" r="2540" b="5715"/>
+            <wp:docPr id="1099548701" name="Picture 1"/>
+            <wp:cNvGraphicFramePr>
+              <a:graphicFrameLocks xmlns:a="http://schemas.openxmlformats.org/drawingml/2006/main" noChangeAspect="1"/>
+            </wp:cNvGraphicFramePr>
+            <a:graphic xmlns:a="http://schemas.openxmlformats.org/drawingml/2006/main">
+              <a:graphicData uri="http://schemas.openxmlformats.org/drawingml/2006/picture">
+                <pic:pic xmlns:pic="http://schemas.openxmlformats.org/drawingml/2006/picture">
+                  <pic:nvPicPr>
+                    <pic:cNvPr id="1099548701" name=""/>
+                    <pic:cNvPicPr/>
+                  </pic:nvPicPr>
+                  <pic:blipFill>
+                    <a:blip r:embed="rId11"/>
+                    <a:stretch>
+                      <a:fillRect/>
+                    </a:stretch>
+                  </pic:blipFill>
+                  <pic:spPr>
+                    <a:xfrm>
+                      <a:off x="0" y="0"/>
+                      <a:ext cx="5731510" cy="2661285"/>
                     </a:xfrm>
                     <a:prstGeom prst="rect">
                       <a:avLst/>
@@ -1080,6 +1107,7 @@
   <w:style w:type="character" w:default="1" w:styleId="DefaultParagraphFont">
     <w:name w:val="Default Paragraph Font"/>
     <w:uiPriority w:val="1"/>
+    <w:semiHidden/>
     <w:unhideWhenUsed/>
   </w:style>
   <w:style w:type="table" w:default="1" w:styleId="TableNormal">

</xml_diff>